<commit_message>
Apply the author's decisions and show figures with their legends
The authors confirmed there was no grant, that the companion orbital
manuscript is not under review, and that orbital tissue came from inactive
TED at decompression. The cover letter now states no specific funding and no
longer calls the companion analysis "under review"; the supplementary orbital
methods are cut to a short descriptive paragraph, keeping those data
secondary. The combined review PDFs now show each figure on its own page
with its legend, and the Figure 3 and S2 legend titles match the figures.

Co-Authored-By: Claude Opus 5.5 <noreply@anthropic.com>
Claude-Session: https://claude.ai/code/session_01TiAKffYKtUstdRZFkwtJA9
</commit_message>
<xml_diff>
--- a/submission/candidate_20261011_review/Cover_Letter_Draft.docx
+++ b/submission/candidate_20261011_review/Cover_Letter_Draft.docx
@@ -430,7 +430,7 @@
         <w:rPr>
           <w:color w:val="000000"/>
         </w:rPr>
-        <w:t xml:space="preserve">An earlier, narrower version was considered at thyroid-focused journals; the work was subsequently restructured around the broader genetic screen. The orbital dataset also supports a different, whole-transcriptome question in a separate manuscript under review elsewhere. Here only three genes are described, and no genome-wide expression or pathway catalogue is presented. The companion manuscript can be provided for assessment of overlap.</w:t>
+        <w:t xml:space="preserve">An earlier, narrower version was considered at thyroid-focused journals; the work was subsequently restructured around the broader genetic screen. The orbital dataset also underlies a separate whole-transcriptome analysis, which is not under review elsewhere; here only three genes are described, and no genome-wide expression or pathway catalogue is presented.</w:t>
       </w:r>
     </w:p>
     <w:p>
@@ -442,7 +442,7 @@
         <w:rPr>
           <w:color w:val="000000"/>
         </w:rPr>
-        <w:t xml:space="preserve">This manuscript has not been published and is not under consideration elsewhere. Funding, competing interests, ethics approval (Pusan National University Hospital IRB 2104-018-102) and written informed consent are declared in the manuscript.</w:t>
+        <w:t xml:space="preserve">This manuscript has not been published and is not under consideration elsewhere. The study received no specific funding, and the authors report no competing interests. The orbital component was approved by the Pusan National University Hospital IRB (2104-018-102), with written informed consent.</w:t>
       </w:r>
     </w:p>
     <w:p>

</xml_diff>

<commit_message>
Fix what the independent check of the display revision found
- Cover letter: BBJ and strict-endpoint colocalization fails only at the most
  conservative prior, not outside the primary prior.
- Table 2 footnote scopes CTLA4 heterogeneity to three of four datasets;
  Table S4 notes UKB single-SNP P values are z-test values; missing
  abbreviations added to every table.
- "European" no longer used for the FinnGen/UKB CTLA4 estimates.
- Figure 1 box borders no longer clipped; Figures 3 and S2 use black
  lettering only (lighter colour scale); full UKB column label; legend fixes.
- Exponents written as true superscripts so the body font has every glyph;
  supplement italics and z-subscripts corrected; near-empty page removed.
- Merged review PDFs numbered continuously.

Co-Authored-By: Claude Opus 5.5 <noreply@anthropic.com>
Claude-Session: https://claude.ai/code/session_01TiAKffYKtUstdRZFkwtJA9
</commit_message>
<xml_diff>
--- a/submission/candidate_20261011_review/Cover_Letter_Draft.docx
+++ b/submission/candidate_20261011_review/Cover_Letter_Draft.docx
@@ -258,7 +258,20 @@
         <w:rPr>
           <w:color w:val="000000"/>
         </w:rPr>
-        <w:t xml:space="preserve">= 1.09×10⁻¹⁴) and FinnGen GD (</w:t>
+        <w:t xml:space="preserve">= 1.09×10</w:t>
+      </w:r>
+      <w:r>
+        <w:rPr>
+          <w:color w:val="000000"/>
+          <w:vertAlign w:val="superscript"/>
+        </w:rPr>
+        <w:t xml:space="preserve">−14</w:t>
+      </w:r>
+      <w:r>
+        <w:rPr>
+          <w:color w:val="000000"/>
+        </w:rPr>
+        <w:t xml:space="preserve">) and FinnGen GD (</w:t>
       </w:r>
       <w:r>
         <w:rPr>
@@ -278,7 +291,20 @@
         <w:rPr>
           <w:color w:val="000000"/>
         </w:rPr>
-        <w:t xml:space="preserve">= 3.19×10⁻³²), in the same direction in all five datasets. Colocalization supported a shared causal variant in Biobank Japan and both ophthalmopathy endpoints (in Biobank Japan and the strict endpoint only under the primary prior) but favored distinct variants in UK Biobank and FinnGen GD, the two datasets with the most cases. We report this discordance prominently rather than set it aside: the data establish association, not expression-mediated causality. All</w:t>
+        <w:t xml:space="preserve">= 3.19×10</w:t>
+      </w:r>
+      <w:r>
+        <w:rPr>
+          <w:color w:val="000000"/>
+          <w:vertAlign w:val="superscript"/>
+        </w:rPr>
+        <w:t xml:space="preserve">−32</w:t>
+      </w:r>
+      <w:r>
+        <w:rPr>
+          <w:color w:val="000000"/>
+        </w:rPr>
+        <w:t xml:space="preserve">), in the same direction in all five datasets. Colocalization supported a shared causal variant in Biobank Japan and both ophthalmopathy endpoints (in Biobank Japan and the strict endpoint, not under the most conservative prior tested) but favored distinct variants in UK Biobank and FinnGen GD, the two datasets with the most cases. We report this discordance prominently rather than set it aside: the data establish association, not expression-mediated causality. All</w:t>
       </w:r>
       <w:r>
         <w:rPr>

</xml_diff>

<commit_message>
Update the author list to the author's decision
Jungyul Park and Min-Seon Kim are equal-contribution co-first authors and
Suk-Woo Yang is the sole corresponding author; Kyung-Hwa Shin is removed from
the author list, affiliations, author contributions, cover letter and
document metadata.

Co-Authored-By: Claude Opus 5.5 <noreply@anthropic.com>
Claude-Session: https://claude.ai/code/session_01TiAKffYKtUstdRZFkwtJA9
</commit_message>
<xml_diff>
--- a/submission/candidate_20261011_review/Cover_Letter_Draft.docx
+++ b/submission/candidate_20261011_review/Cover_Letter_Draft.docx
@@ -504,7 +504,7 @@
         <w:rPr>
           <w:color w:val="000000"/>
         </w:rPr>
-        <w:t xml:space="preserve">Corresponding author, with Kyung-Hwa Shin, MD, as co-corresponding author, on behalf of Jungyul Park, Min-Seon Kim, Kyung-Hwa Shin and Suk-Woo Yang</w:t>
+        <w:t xml:space="preserve">Corresponding author, on behalf of Jungyul Park, Min-Seon Kim and Suk-Woo Yang</w:t>
       </w:r>
       <w:r>
         <w:rPr>
@@ -552,7 +552,7 @@
         <w:rPr>
           <w:color w:val="000000"/>
         </w:rPr>
-        <w:t xml:space="preserve">Author institutions: J. Park and S.-W. Yang, Department of Ophthalmology, Seoul St. Mary’s Hospital, The Catholic University of Korea, Seoul; M.-S. Kim, Department of Ophthalmology, The Catholic University of Korea, Seoul; K.-H. Shin, Department of Laboratory Medicine, Pusan National University Hospital, Busan; Republic of Korea.</w:t>
+        <w:t xml:space="preserve">Author institutions: J. Park and S.-W. Yang, Department of Ophthalmology, Seoul St. Mary’s Hospital, The Catholic University of Korea, Seoul; M.-S. Kim, Department of Ophthalmology, The Catholic University of Korea, Seoul; Republic of Korea.</w:t>
       </w:r>
     </w:p>
     <w:bookmarkEnd w:id="20"/>

</xml_diff>

<commit_message>
Reword the Discussion and Conclusions findings-first
At the author's request, the Discussion now argues from what was found, its
most plausible meaning and the next step, rather than from what the data
cannot show. The Conclusions, the cover letter and one Results sentence were
aligned. Required content is kept in positive form: distinct-variant patterns
in UKB and FinnGen GD (lead variants named as fine-mapping targets), prior
sensitivity, mediation left unresolved, population controls with the
GD-with-versus-without-TED comparison as the next step, and compatibility
with the established benefit of IGF-1R blockade. The audit guard for the
Conclusions was updated to the new wording. The Abstract is unchanged.
Documents rebuilt; main text 3,762 words; audit PASS (357 files, 61 guards).

Co-Authored-By: Claude Opus 5.5 <noreply@anthropic.com>
Claude-Session: https://claude.ai/code/session_01TiAKffYKtUstdRZFkwtJA9
</commit_message>
<xml_diff>
--- a/submission/candidate_20261011_review/Cover_Letter_Draft.docx
+++ b/submission/candidate_20261011_review/Cover_Letter_Draft.docx
@@ -304,7 +304,7 @@
         <w:rPr>
           <w:color w:val="000000"/>
         </w:rPr>
-        <w:t xml:space="preserve">), in the same direction in all five datasets. Colocalization supported a shared causal variant in Biobank Japan and both ophthalmopathy endpoints (in Biobank Japan and the strict endpoint, not under the most conservative prior tested) but favored distinct variants in UK Biobank and FinnGen GD, the two datasets with the most cases. We report this discordance prominently rather than set it aside: the data establish association, not expression-mediated causality. All</w:t>
+        <w:t xml:space="preserve">), in the same direction in all five datasets. Colocalization supported a shared causal variant in Biobank Japan and both ophthalmopathy endpoints (in Biobank Japan and the strict endpoint, not under the most conservative prior tested) and favored distinct nearby variants in UK Biobank and FinnGen GD, the two datasets with the most cases, pointing to candidate variants for fine-mapping. The protective direction fits central tolerance: the expression-increasing</w:t>
       </w:r>
       <w:r>
         <w:rPr>
@@ -318,6 +318,32 @@
           <w:i/>
           <w:color w:val="000000"/>
         </w:rPr>
+        <w:t xml:space="preserve">TSHR</w:t>
+      </w:r>
+      <w:r>
+        <w:rPr>
+          <w:color w:val="000000"/>
+        </w:rPr>
+        <w:t xml:space="preserve"> </w:t>
+      </w:r>
+      <w:r>
+        <w:rPr>
+          <w:color w:val="000000"/>
+        </w:rPr>
+        <w:t xml:space="preserve">allele is coupled with the rs179247 allele previously linked to GD protection and greater thymic transcription. All</w:t>
+      </w:r>
+      <w:r>
+        <w:rPr>
+          <w:color w:val="000000"/>
+        </w:rPr>
+        <w:t xml:space="preserve"> </w:t>
+      </w:r>
+      <w:r>
+        <w:rPr>
+          <w:iCs/>
+          <w:i/>
+          <w:color w:val="000000"/>
+        </w:rPr>
         <w:t xml:space="preserve">IGF1R</w:t>
       </w:r>
       <w:r>
@@ -330,7 +356,7 @@
         <w:rPr>
           <w:color w:val="000000"/>
         </w:rPr>
-        <w:t xml:space="preserve">odds ratios exceeded 1, but only two reached nominal significance, and the most precise estimate, in FinnGen GD, was close to the null.</w:t>
+        <w:t xml:space="preserve">odds ratios exceeded 1, with nominal associations in two datasets; the most precise estimate, in FinnGen GD, was close to the null, compatible with at most a modest inherited effect.</w:t>
       </w:r>
     </w:p>
     <w:p>
@@ -342,7 +368,7 @@
         <w:rPr>
           <w:color w:val="000000"/>
         </w:rPr>
-        <w:t xml:space="preserve">Further analyses test how far these results can be pushed. An allele-direction audit showed that the expression-increasing</w:t>
+        <w:t xml:space="preserve">Further analyses show where the evidence is robust: an allele-direction audit confirmed the</w:t>
       </w:r>
       <w:r>
         <w:rPr>
@@ -368,7 +394,7 @@
         <w:rPr>
           <w:color w:val="000000"/>
         </w:rPr>
-        <w:t xml:space="preserve">allele is coupled with the rs179247 allele previously linked to GD protection and greater thymic transcription. Allele-frequency substitution and instrument-omission analyses show where the evidence is robust and where it depends on single variants. A fixed five-tissue GTEx extension and a small orbital RNA-sequencing series (four TED samples, one control) are reported as supplementary and descriptive; the adipose instruments come from the same</w:t>
+        <w:t xml:space="preserve">direction, and allele-frequency substitution and instrument-omission analyses show where estimates depend on single variants. A fixed five-tissue GTEx extension and a small orbital RNA-sequencing series (four TED samples, one control) are reported as supplementary and descriptive; the adipose instruments come from the same</w:t>
       </w:r>
       <w:r>
         <w:rPr>
@@ -406,33 +432,7 @@
         <w:rPr>
           <w:color w:val="000000"/>
         </w:rPr>
-        <w:t xml:space="preserve">We are equally explicit about what the study does not show. The FinnGen endpoints overlap and use population controls, so they cannot isolate eye-disease susceptibility among people who already have GD. Nothing here predicts treatment response, and weaker genetic evidence for</w:t>
-      </w:r>
-      <w:r>
-        <w:rPr>
-          <w:color w:val="000000"/>
-        </w:rPr>
-        <w:t xml:space="preserve"> </w:t>
-      </w:r>
-      <w:r>
-        <w:rPr>
-          <w:iCs/>
-          <w:i/>
-          <w:color w:val="000000"/>
-        </w:rPr>
-        <w:t xml:space="preserve">IGF1R</w:t>
-      </w:r>
-      <w:r>
-        <w:rPr>
-          <w:color w:val="000000"/>
-        </w:rPr>
-        <w:t xml:space="preserve"> </w:t>
-      </w:r>
-      <w:r>
-        <w:rPr>
-          <w:color w:val="000000"/>
-        </w:rPr>
-        <w:t xml:space="preserve">is not an argument against IGF-1R blockade. The FinnGen extensions and tissue analyses were post hoc and are labeled as such.</w:t>
+        <w:t xml:space="preserve">The results also define clear next steps. Because the FinnGen endpoints overlap and use population controls, eye-disease susceptibility among people who already have GD is best addressed by comparing GD patients with and without TED. The findings concern susceptibility rather than treatment response and are compatible with the established benefit of IGF-1R blockade. The FinnGen extensions and tissue analyses were post hoc and are labeled as such.</w:t>
       </w:r>
     </w:p>
     <w:p>

</xml_diff>